<commit_message>
NSP: correct P5 P8 P9 P11 authored documents and add verified regression gate [skip deploy]
</commit_message>
<xml_diff>
--- a/products-storage/07-uderzhaniya-shtrafy-zachety/03-vozrazhenie-na-zachet.docx
+++ b/products-storage/07-uderzhaniya-shtrafy-zachety/03-vozrazhenie-na-zachet.docx
@@ -21,6 +21,9 @@
         <w:gridCol w:w="5272"/>
       </w:tblGrid>
       <w:tr>
+        <w:trPr>
+          <w:cantSplit/>
+        </w:trPr>
         <w:tc>
           <w:tcPr>
             <w:tcW w:type="dxa" w:w="4025"/>
@@ -154,7 +157,7 @@
           <w:color w:val="262F37"/>
           <w:sz w:val="20"/>
         </w:rPr>
-        <w:t>на односторонний зачет встречных требований</w:t>
+        <w:t>на списание суммы в одностороннем порядке</w:t>
       </w:r>
     </w:p>
     <w:p>
@@ -184,7 +187,7 @@
           <w:color w:val="31363C"/>
           <w:sz w:val="21"/>
         </w:rPr>
-        <w:t>Настоящим сообщаем, что односторонний зачет, произведенный Заказчиком [дата] в размере [сумма] руб., является неправомерным по следующим основаниям.</w:t>
+        <w:t>Возражаем против уменьшения оплаты по заявлению Заказчика от [дата] на [сумма] руб. со ссылкой на прекращение встречных требований зачётом. Наши возражения основаны на следующих обстоятельствах [оставить подтверждённые основания, неприменимые удалить].</w:t>
       </w:r>
     </w:p>
     <w:p>
@@ -199,7 +202,35 @@
           <w:color w:val="31363C"/>
           <w:sz w:val="21"/>
         </w:rPr>
-        <w:t>1. Зачет произведен без письменного согласования с Подрядчиком.</w:t>
+        <w:t>1. [Только при наличии соответствующего договорного ограничения:] нарушен п. [номер] договора, который [запрещает односторонний зачёт / допускает его только по соглашению]. Указать точный текст и обстоятельства нарушения.</w:t>
+      </w:r>
+    </w:p>
+    <w:p>
+      <w:pPr>
+        <w:widowControl/>
+        <w:spacing w:before="0" w:after="60" w:line="271" w:lineRule="auto"/>
+      </w:pPr>
+      <w:r>
+        <w:rPr>
+          <w:rFonts w:ascii="Arial" w:hAnsi="Arial" w:eastAsia="Arial" w:cs="Arial"/>
+          <w:i w:val="0"/>
+          <w:color w:val="31363C"/>
+          <w:sz w:val="21"/>
+        </w:rPr>
+        <w:t xml:space="preserve">По </w:t>
+      </w:r>
+      <w:hyperlink r:id="rId11">
+        <w:r>
+          <w:rPr>
+            <w:sz w:val="18"/>
+            <w:color w:val="806238"/>
+            <w:u w:val="single"/>
+          </w:rPr>
+          <w:t>ст. 410 ГК РФ</w:t>
+        </w:r>
+      </w:hyperlink>
+      <w:r>
+        <w:t xml:space="preserve"> для зачёта может быть достаточно заявления одной стороны. Отсутствие нашего согласия само по себе не доказывает нарушение; договорное ограничение приводится только при его наличии и применимости.</w:t>
       </w:r>
     </w:p>
     <w:p>
@@ -214,22 +245,7 @@
           <w:color w:val="31363C"/>
           <w:sz w:val="21"/>
         </w:rPr>
-        <w:t xml:space="preserve">   Согласно ст. 410 ГК РФ зачет встречных однородных требований допускается при заявлении одной стороны. Однако в договоре подряда стороны могут ограничить или исключить такое право (ст. 411 ГК РФ: зачёт не допускается в случаях, предусмотренных законом или договором).</w:t>
-      </w:r>
-    </w:p>
-    <w:p>
-      <w:pPr>
-        <w:widowControl/>
-        <w:spacing w:before="0" w:after="80" w:line="271" w:lineRule="auto"/>
-      </w:pPr>
-      <w:r>
-        <w:rPr>
-          <w:rFonts w:ascii="Arial" w:hAnsi="Arial" w:eastAsia="Arial" w:cs="Arial"/>
-          <w:i w:val="0"/>
-          <w:color w:val="31363C"/>
-          <w:sz w:val="21"/>
-        </w:rPr>
-        <w:t>2. Требование Заказчика, на которое произведен зачет, является необоснованным / оспариваемым / не подтвержденным доказательствами.</w:t>
+        <w:t>2. Требование Заказчика не подтверждено в части [сумма] руб. по конкретным фактическим и правовым основаниям: [отсутствие нарушения / причинной связи / неверный объём / завышенный расчёт / иное]. Само наличие спора о требовании не является самостоятельным запретом зачёта.</w:t>
       </w:r>
     </w:p>
     <w:p>
@@ -280,7 +296,7 @@
     <w:p>
       <w:pPr>
         <w:widowControl/>
-        <w:spacing w:before="0" w:after="80" w:line="271" w:lineRule="auto"/>
+        <w:spacing w:before="0" w:after="60" w:line="271" w:lineRule="auto"/>
       </w:pPr>
       <w:r>
         <w:rPr>
@@ -289,13 +305,26 @@
           <w:color w:val="31363C"/>
           <w:sz w:val="21"/>
         </w:rPr>
-        <w:t xml:space="preserve">   - Срок исполнения встречного требования Заказчика не наступил (ст. 410 ГК РФ).</w:t>
+        <w:t xml:space="preserve">   - Срок исполнения встречного требования Заказчика не наступил (</w:t>
+      </w:r>
+      <w:hyperlink r:id="rId11">
+        <w:r>
+          <w:rPr>
+            <w:sz w:val="18"/>
+            <w:color w:val="806238"/>
+            <w:u w:val="single"/>
+          </w:rPr>
+          <w:t>ст. 410 ГК РФ</w:t>
+        </w:r>
+      </w:hyperlink>
+      <w:r>
+        <w:t>).</w:t>
       </w:r>
     </w:p>
     <w:p>
       <w:pPr>
         <w:widowControl/>
-        <w:spacing w:before="0" w:after="80" w:line="271" w:lineRule="auto"/>
+        <w:spacing w:before="0" w:after="60" w:line="271" w:lineRule="auto"/>
       </w:pPr>
       <w:r>
         <w:rPr>
@@ -304,7 +333,20 @@
           <w:color w:val="31363C"/>
           <w:sz w:val="21"/>
         </w:rPr>
-        <w:t xml:space="preserve">   - [Только если встречное требование Заказчика не денежное (например, о передаче вещи или о безвозмездном устранении недостатков) и оставалось таким на дату заявления о зачёте; к неустойке, процентам и убыткам не применяется:] Встречное требование Заказчика не однородно с денежным требованием Подрядчика (ст. 410 ГК РФ).</w:t>
+        <w:t xml:space="preserve">   - [Только если встречное требование Заказчика не денежное (например, о передаче вещи или о безвозмездном устранении недостатков) и оставалось таким на дату заявления о зачёте; к неустойке, процентам и убыткам не применяется:] Встречное требование Заказчика не однородно с денежным требованием Подрядчика (</w:t>
+      </w:r>
+      <w:hyperlink r:id="rId11">
+        <w:r>
+          <w:rPr>
+            <w:sz w:val="18"/>
+            <w:color w:val="806238"/>
+            <w:u w:val="single"/>
+          </w:rPr>
+          <w:t>ст. 410 ГК РФ</w:t>
+        </w:r>
+      </w:hyperlink>
+      <w:r>
+        <w:t>).</w:t>
       </w:r>
     </w:p>
     <w:p>
@@ -350,7 +392,7 @@
           <w:color w:val="31363C"/>
           <w:sz w:val="21"/>
         </w:rPr>
-        <w:t xml:space="preserve">   - Признать зачет неправомерным.</w:t>
+        <w:t xml:space="preserve">   - Пересмотреть уменьшение оплаты в оспариваемой части [сумма] руб. по приведённым основаниям.</w:t>
       </w:r>
     </w:p>
     <w:p>
@@ -365,7 +407,7 @@
           <w:color w:val="31363C"/>
           <w:sz w:val="21"/>
         </w:rPr>
-        <w:t xml:space="preserve">   - Вернуть незаконно зачтенную сумму [сумма] руб.</w:t>
+        <w:t xml:space="preserve">   - Уплатить непогашенную задолженность за работы [сумма] руб. с учётом установленного срока оплаты и приложенного расчёта.</w:t>
       </w:r>
     </w:p>
     <w:p>
@@ -380,7 +422,7 @@
           <w:color w:val="31363C"/>
           <w:sz w:val="21"/>
         </w:rPr>
-        <w:t xml:space="preserve">   - [Или:] Произвести зачет в согласованном с Подрядчиком размере [сумма] руб.</w:t>
+        <w:t xml:space="preserve">   - Представить документы и подробный расчёт встречного требования; провести сверку спорных позиций до [дата].</w:t>
       </w:r>
     </w:p>
     <w:p>

</xml_diff>